<commit_message>
Artigo: curso, instituição e e-mails dos autores
Co-Authored-By: Claude Opus 5.5 <noreply@anthropic.com>
Claude-Session: https://claude.ai/code/session_01RnK4Sw3wTq2MY4U8dZPj8G
</commit_message>
<xml_diff>
--- a/docs/artigo/NOMADE RUN - Artigo Científico (1ª versão).docx
+++ b/docs/artigo/NOMADE RUN - Artigo Científico (1ª versão).docx
@@ -74,21 +74,15 @@
         <w:pStyle w:val="BodyText"/>
       </w:pPr>
       <w:r>
-        <w:t xml:space="preserve">[Curso] — [Instituição]</w:t>
-      </w:r>
-      <w:r>
-        <w:t xml:space="preserve"> </w:t>
-      </w:r>
-      <w:r>
-        <w:t xml:space="preserve">· Projeto de Desenvolvimento de Software (PDS)</w:t>
-      </w:r>
-    </w:p>
-    <w:p>
-      <w:pPr>
-        <w:pStyle w:val="BodyText"/>
-      </w:pPr>
-      <w:r>
-        <w:t xml:space="preserve">[e-mails dos autores]</w:t>
+        <w:t xml:space="preserve">Engenharia de Software — UNIFAN · Projeto de Desenvolvimento de Software (PDS)</w:t>
+      </w:r>
+    </w:p>
+    <w:p>
+      <w:pPr>
+        <w:pStyle w:val="BodyText"/>
+      </w:pPr>
+      <w:r>
+        <w:t xml:space="preserve">byelgomys@gmail.com, mateusbrito07@gmail.com</w:t>
       </w:r>
     </w:p>
     <w:p>

</xml_diff>